<commit_message>
Expand the YouTube/coaching entrepreneurship entry on the CV
Rewrote the "Founder & Creator" bullets to read as a single arc —
built an audience, turned it into a product by building a sales website
and selling courses, delivered a coaching service on top of that, and
ran content production solo — rather than four disconnected facts. No
new claims: same channel, same website, same coaching calls, same
CapCut/Clipchamp/Canva production work already on the site.

Co-Authored-By: Claude Sonnet 5 <noreply@anthropic.com>
</commit_message>
<xml_diff>
--- a/cv-document/Ismail_Mazhar_CV.docx
+++ b/cv-document/Ismail_Mazhar_CV.docx
@@ -112,7 +112,7 @@
         </w:rPr>
         <w:t xml:space="preserve">   |   </w:t>
       </w:r>
-      <w:hyperlink w:history="1" r:id="rIdvjdli3xsgdlabfpmdhi_s">
+      <w:hyperlink w:history="1" r:id="rId1l7chglpnktkgcwvzupet">
         <w:r>
           <w:rPr>
             <w:rFonts w:ascii="Calibri" w:cs="Calibri" w:eastAsia="Calibri" w:hAnsi="Calibri"/>
@@ -656,7 +656,7 @@
           <w:sz w:val="19"/>
           <w:szCs w:val="19"/>
         </w:rPr>
-        <w:t xml:space="preserve">Independent</w:t>
+        <w:t xml:space="preserve">Independent — solo entrepreneurial venture</w:t>
       </w:r>
     </w:p>
     <w:p>
@@ -675,7 +675,7 @@
           <w:sz w:val="19"/>
           <w:szCs w:val="19"/>
         </w:rPr>
-        <w:t xml:space="preserve">Built a YouTube channel and Discord community helping young men with self-improvement, reaching viewers across many countries.</w:t>
+        <w:t xml:space="preserve">Built a self-improvement YouTube channel and companion Discord community from zero, growing an engaged audience of young men across many countries.</w:t>
       </w:r>
     </w:p>
     <w:p>
@@ -694,7 +694,7 @@
           <w:sz w:val="19"/>
           <w:szCs w:val="19"/>
         </w:rPr>
-        <w:t xml:space="preserve">Created and sold online courses through a self-built website.</w:t>
+        <w:t xml:space="preserve">Turned that audience into a business: designed, built, and launched a sales website from scratch to package and sell original online courses directly to viewers.</w:t>
       </w:r>
     </w:p>
     <w:p>
@@ -713,7 +713,7 @@
           <w:sz w:val="19"/>
           <w:szCs w:val="19"/>
         </w:rPr>
-        <w:t xml:space="preserve">Ran free 1:1 coaching calls (booked via Calendly) with people of varied ages and backgrounds.</w:t>
+        <w:t xml:space="preserve">Delivered free 1:1 coaching calls (booked via Calendly) to clients of varied ages and backgrounds, converting an anonymous audience into a hands-on, word-of-mouth community.</w:t>
       </w:r>
     </w:p>
     <w:p>
@@ -732,7 +732,7 @@
           <w:sz w:val="19"/>
           <w:szCs w:val="19"/>
         </w:rPr>
-        <w:t xml:space="preserve">Wrote scripts, filmed and edited videos (CapCut, Clipchamp), and designed thumbnails from scratch in Canva; applied YouTube growth tactics.</w:t>
+        <w:t xml:space="preserve">Owned content production solo end-to-end — writing scripts, filming and editing every video (CapCut, Clipchamp), and designing thumbnails from scratch in Canva — while applying YouTube growth and audience-retention tactics to keep scaling reach.</w:t>
       </w:r>
     </w:p>
     <w:p>

</xml_diff>

<commit_message>
Add the course-sales website as its own Independent Projects entry
The YouTube/coaching venture was already in Experience; this adds the
site itself (the actual artifact) to Projects, where the rest of what's
been built lives. Placed first and ahead of the "AI-assisted development"
note, since how this one was built was never established and the other
five entries are where that note is actually true.

Co-Authored-By: Claude Sonnet 5 <noreply@anthropic.com>
</commit_message>
<xml_diff>
--- a/cv-document/Ismail_Mazhar_CV.docx
+++ b/cv-document/Ismail_Mazhar_CV.docx
@@ -112,7 +112,7 @@
         </w:rPr>
         <w:t xml:space="preserve">   |   </w:t>
       </w:r>
-      <w:hyperlink w:history="1" r:id="rId1l7chglpnktkgcwvzupet">
+      <w:hyperlink w:history="1" r:id="rIdjq-sydmy1gmjws1smsctz">
         <w:r>
           <w:rPr>
             <w:rFonts w:ascii="Calibri" w:cs="Calibri" w:eastAsia="Calibri" w:hAnsi="Calibri"/>
@@ -841,7 +841,50 @@
     </w:p>
     <w:p>
       <w:pPr>
-        <w:spacing w:after="120"/>
+        <w:keepNext/>
+        <w:spacing w:after="20" w:before="0"/>
+      </w:pPr>
+      <w:r>
+        <w:rPr>
+          <w:rFonts w:ascii="Calibri" w:cs="Calibri" w:eastAsia="Calibri" w:hAnsi="Calibri"/>
+          <w:b/>
+          <w:bCs/>
+          <w:color w:val="1A1A1E"/>
+          <w:sz w:val="21"/>
+          <w:szCs w:val="21"/>
+        </w:rPr>
+        <w:t xml:space="preserve">Course Sales Website  —  Creator</w:t>
+      </w:r>
+      <w:r>
+        <w:rPr>
+          <w:rFonts w:ascii="Calibri" w:cs="Calibri" w:eastAsia="Calibri" w:hAnsi="Calibri"/>
+          <w:i/>
+          <w:iCs/>
+          <w:color w:val="5B5B63"/>
+          <w:sz w:val="19"/>
+          <w:szCs w:val="19"/>
+        </w:rPr>
+        <w:ptab w:alignment="right" w:relativeTo="margin" w:leader="none"/>
+        <w:t xml:space="preserve">2023 – 2024</w:t>
+      </w:r>
+    </w:p>
+    <w:p>
+      <w:pPr>
+        <w:spacing w:after="40"/>
+      </w:pPr>
+      <w:r>
+        <w:rPr>
+          <w:rFonts w:ascii="Calibri" w:cs="Calibri" w:eastAsia="Calibri" w:hAnsi="Calibri"/>
+          <w:color w:val="1A1A1E"/>
+          <w:sz w:val="19"/>
+          <w:szCs w:val="19"/>
+        </w:rPr>
+        <w:t xml:space="preserve">Self-built e-commerce site to package, market, and sell original self-improvement video courses — the first monetized product built on top of the YouTube/Discord audience.</w:t>
+      </w:r>
+    </w:p>
+    <w:p>
+      <w:pPr>
+        <w:spacing w:after="120" w:before="160"/>
       </w:pPr>
       <w:r>
         <w:rPr>

</xml_diff>

<commit_message>
Add the YouTube channel & community as its own project entry
Split the single "Course Sales Website" entry into two: the channel/
Discord community itself (the content brand, as a founded product) and
the website built on top of it (the commerce layer). Reworded the
channel entry so it reads as a distinct angle from the Experience
bullets — the idea and solo production craft — rather than repeating
"grew an audience" in near-identical words.

Co-Authored-By: Claude Sonnet 5 <noreply@anthropic.com>
</commit_message>
<xml_diff>
--- a/cv-document/Ismail_Mazhar_CV.docx
+++ b/cv-document/Ismail_Mazhar_CV.docx
@@ -112,7 +112,7 @@
         </w:rPr>
         <w:t xml:space="preserve">   |   </w:t>
       </w:r>
-      <w:hyperlink w:history="1" r:id="rIdjq-sydmy1gmjws1smsctz">
+      <w:hyperlink w:history="1" r:id="rIdeu_ptg8npwyzs3j3wxxb-">
         <w:r>
           <w:rPr>
             <w:rFonts w:ascii="Calibri" w:cs="Calibri" w:eastAsia="Calibri" w:hAnsi="Calibri"/>
@@ -853,7 +853,7 @@
           <w:sz w:val="21"/>
           <w:szCs w:val="21"/>
         </w:rPr>
-        <w:t xml:space="preserve">Course Sales Website  —  Creator</w:t>
+        <w:t xml:space="preserve">Self-Improvement YouTube Channel &amp; Community  —  Founder &amp; Creator</w:t>
       </w:r>
       <w:r>
         <w:rPr>
@@ -879,7 +879,50 @@
           <w:sz w:val="19"/>
           <w:szCs w:val="19"/>
         </w:rPr>
-        <w:t xml:space="preserve">Self-built e-commerce site to package, market, and sell original self-improvement video courses — the first monetized product built on top of the YouTube/Discord audience.</w:t>
+        <w:t xml:space="preserve">A content brand built around one idea — scripted self-improvement videos paired with a Discord for hands-on follow-through. Owned every part of production solo: scripts, filming, editing, and thumbnail design.</w:t>
+      </w:r>
+    </w:p>
+    <w:p>
+      <w:pPr>
+        <w:keepNext/>
+        <w:spacing w:after="20" w:before="160"/>
+      </w:pPr>
+      <w:r>
+        <w:rPr>
+          <w:rFonts w:ascii="Calibri" w:cs="Calibri" w:eastAsia="Calibri" w:hAnsi="Calibri"/>
+          <w:b/>
+          <w:bCs/>
+          <w:color w:val="1A1A1E"/>
+          <w:sz w:val="21"/>
+          <w:szCs w:val="21"/>
+        </w:rPr>
+        <w:t xml:space="preserve">Course Sales Website  —  Creator</w:t>
+      </w:r>
+      <w:r>
+        <w:rPr>
+          <w:rFonts w:ascii="Calibri" w:cs="Calibri" w:eastAsia="Calibri" w:hAnsi="Calibri"/>
+          <w:i/>
+          <w:iCs/>
+          <w:color w:val="5B5B63"/>
+          <w:sz w:val="19"/>
+          <w:szCs w:val="19"/>
+        </w:rPr>
+        <w:ptab w:alignment="right" w:relativeTo="margin" w:leader="none"/>
+        <w:t xml:space="preserve">2023 – 2024</w:t>
+      </w:r>
+    </w:p>
+    <w:p>
+      <w:pPr>
+        <w:spacing w:after="40"/>
+      </w:pPr>
+      <w:r>
+        <w:rPr>
+          <w:rFonts w:ascii="Calibri" w:cs="Calibri" w:eastAsia="Calibri" w:hAnsi="Calibri"/>
+          <w:color w:val="1A1A1E"/>
+          <w:sz w:val="19"/>
+          <w:szCs w:val="19"/>
+        </w:rPr>
+        <w:t xml:space="preserve">Self-built e-commerce site to package, market, and sell original self-improvement video courses — the first monetized product built on top of that audience.</w:t>
       </w:r>
     </w:p>
     <w:p>

</xml_diff>

<commit_message>
Drop "free" from the coaching bullet; merge the two early projects into one
- Experience: "Delivered 1:1 coaching calls" (was "free 1:1 coaching calls").
- Projects: the YouTube/community entry and the course-website entry read
  almost identically to what Experience already says, so merged into a
  single "Self-Improvement Brand — Course Sales Website" line that points
  back to Experience for the full story and only names the website as the
  built artifact.

Co-Authored-By: Claude Sonnet 5 <noreply@anthropic.com>
</commit_message>
<xml_diff>
--- a/cv-document/Ismail_Mazhar_CV.docx
+++ b/cv-document/Ismail_Mazhar_CV.docx
@@ -112,7 +112,7 @@
         </w:rPr>
         <w:t xml:space="preserve">   |   </w:t>
       </w:r>
-      <w:hyperlink w:history="1" r:id="rIdeu_ptg8npwyzs3j3wxxb-">
+      <w:hyperlink w:history="1" r:id="rIdal_mt7ych0q4r1ycmcxs9">
         <w:r>
           <w:rPr>
             <w:rFonts w:ascii="Calibri" w:cs="Calibri" w:eastAsia="Calibri" w:hAnsi="Calibri"/>
@@ -713,7 +713,7 @@
           <w:sz w:val="19"/>
           <w:szCs w:val="19"/>
         </w:rPr>
-        <w:t xml:space="preserve">Delivered free 1:1 coaching calls (booked via Calendly) to clients of varied ages and backgrounds, converting an anonymous audience into a hands-on, word-of-mouth community.</w:t>
+        <w:t xml:space="preserve">Delivered 1:1 coaching calls (booked via Calendly) to clients of varied ages and backgrounds, converting an anonymous audience into a hands-on, word-of-mouth community.</w:t>
       </w:r>
     </w:p>
     <w:p>
@@ -853,7 +853,7 @@
           <w:sz w:val="21"/>
           <w:szCs w:val="21"/>
         </w:rPr>
-        <w:t xml:space="preserve">Self-Improvement YouTube Channel &amp; Community  —  Founder &amp; Creator</w:t>
+        <w:t xml:space="preserve">Self-Improvement Brand — Course Sales Website  —  Founder &amp; Creator</w:t>
       </w:r>
       <w:r>
         <w:rPr>
@@ -879,50 +879,7 @@
           <w:sz w:val="19"/>
           <w:szCs w:val="19"/>
         </w:rPr>
-        <w:t xml:space="preserve">A content brand built around one idea — scripted self-improvement videos paired with a Discord for hands-on follow-through. Owned every part of production solo: scripts, filming, editing, and thumbnail design.</w:t>
-      </w:r>
-    </w:p>
-    <w:p>
-      <w:pPr>
-        <w:keepNext/>
-        <w:spacing w:after="20" w:before="160"/>
-      </w:pPr>
-      <w:r>
-        <w:rPr>
-          <w:rFonts w:ascii="Calibri" w:cs="Calibri" w:eastAsia="Calibri" w:hAnsi="Calibri"/>
-          <w:b/>
-          <w:bCs/>
-          <w:color w:val="1A1A1E"/>
-          <w:sz w:val="21"/>
-          <w:szCs w:val="21"/>
-        </w:rPr>
-        <w:t xml:space="preserve">Course Sales Website  —  Creator</w:t>
-      </w:r>
-      <w:r>
-        <w:rPr>
-          <w:rFonts w:ascii="Calibri" w:cs="Calibri" w:eastAsia="Calibri" w:hAnsi="Calibri"/>
-          <w:i/>
-          <w:iCs/>
-          <w:color w:val="5B5B63"/>
-          <w:sz w:val="19"/>
-          <w:szCs w:val="19"/>
-        </w:rPr>
-        <w:ptab w:alignment="right" w:relativeTo="margin" w:leader="none"/>
-        <w:t xml:space="preserve">2023 – 2024</w:t>
-      </w:r>
-    </w:p>
-    <w:p>
-      <w:pPr>
-        <w:spacing w:after="40"/>
-      </w:pPr>
-      <w:r>
-        <w:rPr>
-          <w:rFonts w:ascii="Calibri" w:cs="Calibri" w:eastAsia="Calibri" w:hAnsi="Calibri"/>
-          <w:color w:val="1A1A1E"/>
-          <w:sz w:val="19"/>
-          <w:szCs w:val="19"/>
-        </w:rPr>
-        <w:t xml:space="preserve">Self-built e-commerce site to package, market, and sell original self-improvement video courses — the first monetized product built on top of that audience.</w:t>
+        <w:t xml:space="preserve">The storefront behind the YouTube/Discord venture (see Experience) — designed, built, and launched solo to package and sell original video courses directly to that audience.</w:t>
       </w:r>
     </w:p>
     <w:p>

</xml_diff>